<commit_message>
Mark current private fund role as ongoing.
Show the role as 2026.06 - present since the candidate has not resigned, and reframe the momentum strategy work around research method and regime limits rather than headline returns.

Co-authored-by: invy95 <invy95@users.noreply.github.com>
</commit_message>
<xml_diff>
--- a/resume/YinWei_Guolian_Quant_Resume.docx
+++ b/resume/YinWei_Guolian_Quant_Resume.docx
@@ -106,7 +106,7 @@
           <w:b w:val="0"/>
           <w:sz w:val="21"/>
         </w:rPr>
-        <w:t>6年量化研究经历，覆盖多头选股、财务/基本面选股、行业与赛道轮动、套利与做市、股指期货CTA；可独立完成数据清洗、因子挖掘、回测验证、组合构建与实盘跟踪。</w:t>
+        <w:t>6年量化研究经历，覆盖多头选股、财务与基本面选股、行业与赛道轮动、套利与做市、股指期货CTA；可独立完成数据清洗、因子挖掘、回测验证、组合构建与实盘跟踪全流程。</w:t>
       </w:r>
     </w:p>
     <w:p>
@@ -120,7 +120,7 @@
           <w:b w:val="0"/>
           <w:sz w:val="21"/>
         </w:rPr>
-        <w:t>股票量化：搭建标准化财务选股模型与季度核心股票池；用分钟级板块因子叠加日线量价因子做择时选股；掘金策略样本内年化17.14%、最大回撤2%、夏普3.4。</w:t>
+        <w:t>股票量化：搭建标准化财务选股模型与季度核心股票池；以分钟级板块因子叠加日线量价因子做择时选股，掘金策略样本内年化17.14%、最大回撤2%、夏普3.4。</w:t>
       </w:r>
     </w:p>
     <w:p>
@@ -134,7 +134,7 @@
           <w:b w:val="0"/>
           <w:sz w:val="21"/>
         </w:rPr>
-        <w:t>实盘跟踪：2025年资金加权收益率年化约60%；2026年截至8月年化约40%。具备回撤拆解、参数与因子组合优化、策略迭代经验。</w:t>
+        <w:t>实盘跟踪与归因：2025年资金加权收益率年化约60%，2026年截至8月约40%；具备回撤拆解、参数与因子组合稳健性检验、策略迭代经验。</w:t>
       </w:r>
     </w:p>
     <w:p>
@@ -148,7 +148,7 @@
           <w:b w:val="0"/>
           <w:sz w:val="21"/>
         </w:rPr>
-        <w:t>数据与工程：Python（Pandas / Numpy / Talib）处理日频与分钟行情、财报与业绩预告数据；有Linux服务器部署回测/推送脚本经验；了解A股停复牌、涨跌停、流动性与交易成本对回测和实盘的影响。</w:t>
+        <w:t>数据与工程：Python（Pandas / Numpy / Talib）处理日频与分钟行情、财报与业绩预告等截面数据；可在Linux服务器完成回测与信号脚本部署、定时任务与日志监控。</w:t>
       </w:r>
     </w:p>
     <w:p>
@@ -162,7 +162,7 @@
           <w:b w:val="0"/>
           <w:sz w:val="21"/>
         </w:rPr>
-        <w:t>对冲与衍生品相关：期货CTA模式识别、套利/做市策略维护；理解期现对冲与中性化思路，可向指数增强、市场中性方向迁移。</w:t>
+        <w:t>实盘约束意识：关注A股停复牌、涨跌停、交易成本、滑点与可成交性对回测与实盘差异的影响，回测中重视样本外表现与过拟合识别。</w:t>
       </w:r>
     </w:p>
     <w:p>
@@ -217,7 +217,7 @@
                 <w:color w:val="2D2D2D"/>
                 <w:sz w:val="21"/>
               </w:rPr>
-              <w:t>【请填公司全称】  |  投资业务部  |  量化研究 / AI投研</w:t>
+              <w:t>【请填公司全称】（私募基金）  |  量化研究</w:t>
             </w:r>
           </w:p>
         </w:tc>
@@ -238,7 +238,7 @@
                 <w:color w:val="555555"/>
                 <w:sz w:val="20"/>
               </w:rPr>
-              <w:t>2026.06 – 2026.08</w:t>
+              <w:t>2026.06 – 至今</w:t>
             </w:r>
           </w:p>
         </w:tc>
@@ -255,7 +255,7 @@
           <w:b w:val="0"/>
           <w:sz w:val="21"/>
         </w:rPr>
-        <w:t>强势股放量策略改版回测：增加「收盘价/前20日最低价&lt;130%」过滤，完善收益率测算与多组对照指标，最大亏损由-27%降至-17%；完成盘中放量扫描与重点股票池分钟级信息推送。</w:t>
+        <w:t>承接强势股放量策略的验证与优化：设计「收盘价/前20日最低价&lt;130%」等过滤条件，重构收益率测算逻辑，用控制变量法搭建4组14项指标的回测对照表，最大单笔亏损由-27%压缩至-17%。</w:t>
       </w:r>
     </w:p>
     <w:p>
@@ -269,7 +269,21 @@
           <w:b w:val="0"/>
           <w:sz w:val="21"/>
         </w:rPr>
-        <w:t>在Linux服务器部署投研脚本、定时任务与实时推送；用Python完成策略回测对照表（控制变量、多指标评价）及数据核验，保证结果可复现。</w:t>
+        <w:t>识别该类短线动量策略的适用边界：收益主要来自放量突破后的趋势延续，在低波动与下跌区间信号质量明显下降，据此提出加入市场状态过滤与仓位控制的改进方向。</w:t>
+      </w:r>
+    </w:p>
+    <w:p>
+      <w:pPr>
+        <w:pStyle w:val="ListBullet"/>
+        <w:spacing w:after="24" w:before="0" w:line="259" w:lineRule="auto"/>
+      </w:pPr>
+      <w:r>
+        <w:rPr>
+          <w:rFonts w:ascii="宋体" w:hAnsi="宋体" w:eastAsia="宋体"/>
+          <w:b w:val="0"/>
+          <w:sz w:val="21"/>
+        </w:rPr>
+        <w:t>负责分钟级行情扫描与信号推送落地，并在Linux服务器完成投研脚本部署、定时任务与日志监控，保证信号生成可复现、可跟踪。</w:t>
       </w:r>
     </w:p>
     <w:tbl>
@@ -345,7 +359,7 @@
           <w:b w:val="0"/>
           <w:sz w:val="21"/>
         </w:rPr>
-        <w:t>行业/赛道轮动：结合宏观与行业框架跟踪热点赛道，为多头策略定调；完善短线买卖点与持仓纪律，持续做实盘跟踪与归因。</w:t>
+        <w:t>行业与赛道轮动：结合宏观与行业框架跟踪热点赛道并为多头策略定调；完善短线买卖点与持仓纪律，持续做实盘跟踪与收益归因。</w:t>
       </w:r>
     </w:p>
     <w:p>
@@ -359,7 +373,7 @@
           <w:b w:val="0"/>
           <w:sz w:val="21"/>
         </w:rPr>
-        <w:t>基本面因子与选股：搭建标准化财务选股模型，按季度更新核心股票池；建设全市场财报采集及业绩预告/快报爬虫，将基本面数据接入选股流程。</w:t>
+        <w:t>基本面因子与选股：搭建标准化财务选股模型，按季度更新核心股票池；建设全市场财报采集与业绩预告/快报爬虫，将基本面与事件数据接入选股流程。</w:t>
       </w:r>
     </w:p>
     <w:p>
@@ -373,7 +387,7 @@
           <w:b w:val="0"/>
           <w:sz w:val="21"/>
         </w:rPr>
-        <w:t>实盘结果：2025年资金加权年化约60%，2026年截至8月年化约40%（含后续自我管理账户跟踪）。</w:t>
+        <w:t>实盘结果：2025年资金加权年化约60%，2026年截至8月约40%。</w:t>
       </w:r>
     </w:p>
     <w:tbl>
@@ -463,7 +477,7 @@
           <w:b w:val="0"/>
           <w:sz w:val="21"/>
         </w:rPr>
-        <w:t>参与套利、做市等策略开发与日常优化，关注价差、库存/库存风险、成交质量与策略稳定性。</w:t>
+        <w:t>参与套利、做市等策略开发与日常优化，关注价差、持仓风险、成交质量与策略稳定性。</w:t>
       </w:r>
     </w:p>
     <w:tbl>
@@ -539,7 +553,7 @@
           <w:b w:val="0"/>
           <w:sz w:val="21"/>
         </w:rPr>
-        <w:t>对北上深量化私募做问卷设计、实地尽调并撰写尽调报告，覆盖策略逻辑、风险控制、实盘约束等。</w:t>
+        <w:t>对北上深量化私募开展问卷设计与实地尽调并撰写尽调报告，覆盖策略逻辑、因子来源、风险控制与实盘约束。</w:t>
       </w:r>
     </w:p>
     <w:p>
@@ -553,7 +567,7 @@
           <w:b w:val="0"/>
           <w:sz w:val="21"/>
         </w:rPr>
-        <w:t>搭建二级市场研究框架，跟踪流动性等风险指标，服务投研与配置判断。</w:t>
+        <w:t>搭建二级市场研究框架，跟踪流动性等风险指标，服务投研判断与资产配置。</w:t>
       </w:r>
     </w:p>
     <w:tbl>
@@ -629,7 +643,7 @@
           <w:b w:val="0"/>
           <w:sz w:val="21"/>
         </w:rPr>
-        <w:t>基于聚宽、掘金开展股票/期货因子挖掘、策略开发与回测优化，覆盖日频量价与基本面相关因子。</w:t>
+        <w:t>基于聚宽、掘金开展股票与期货因子挖掘、策略开发及回测优化，覆盖日频量价与基本面相关因子。</w:t>
       </w:r>
     </w:p>
     <w:p>
@@ -643,7 +657,7 @@
           <w:b w:val="0"/>
           <w:sz w:val="21"/>
         </w:rPr>
-        <w:t>按基金经理要求用Python复现券商金工研报，校验因子定义、去极值/标准化、回测口径与样本外表现。</w:t>
+        <w:t>按基金经理要求用Python复现券商金工研报，校验因子定义、去极值与标准化处理、回测口径及样本外表现。</w:t>
       </w:r>
     </w:p>
     <w:tbl>
@@ -719,7 +733,7 @@
           <w:b w:val="0"/>
           <w:sz w:val="21"/>
         </w:rPr>
-        <w:t>用Excel完成再保人月度资信更新、季度坏账计提与风险指标监控；汇总关联/非关联交易数据。</w:t>
+        <w:t>负责再保人月度资信更新、季度坏账计提与风险指标监控，并汇总关联与非关联交易数据。</w:t>
       </w:r>
     </w:p>
     <w:p>
@@ -795,7 +809,7 @@
                 <w:color w:val="555555"/>
                 <w:sz w:val="20"/>
               </w:rPr>
-              <w:t>2022.07 – 2026.08</w:t>
+              <w:t>2022.07 – 至今</w:t>
             </w:r>
           </w:p>
         </w:tc>
@@ -826,7 +840,7 @@
           <w:b w:val="0"/>
           <w:sz w:val="21"/>
         </w:rPr>
-        <w:t>用分钟级板块因子刻画短线强度与拥挤度，结合日线量价因子做择时与选股，形成可回测、可复现的研究流程。</w:t>
+        <w:t>用分钟级板块因子刻画短线强度与拥挤度，结合日线量价因子完成择时与选股，形成可回测、可复现的研究流程。</w:t>
       </w:r>
     </w:p>
     <w:p>
@@ -840,7 +854,7 @@
           <w:b w:val="0"/>
           <w:sz w:val="21"/>
         </w:rPr>
-        <w:t>回测中关注收益、回撤、夏普、换手与参数稳健性；样本内最大回撤2%，年化17.14%，夏普比率3.4。</w:t>
+        <w:t>回测关注收益、回撤、夏普、换手与参数稳健性；样本内最大回撤2%，年化17.14%，夏普比率3.4。</w:t>
       </w:r>
     </w:p>
     <w:p>
@@ -854,7 +868,7 @@
           <w:b w:val="0"/>
           <w:sz w:val="21"/>
         </w:rPr>
-        <w:t>编写实盘策略并接入掘金日更数据，跟踪信号衰减、滑点与可成交性，持续迭代因子与进出场规则。</w:t>
+        <w:t>编写实盘策略接入掘金日更数据，跟踪信号衰减、滑点与可成交性，持续迭代因子与进出场规则。</w:t>
       </w:r>
     </w:p>
     <w:tbl>
@@ -892,7 +906,7 @@
                 <w:color w:val="2D2D2D"/>
                 <w:sz w:val="21"/>
               </w:rPr>
-              <w:t>股票短线多头与基本面选股研究</w:t>
+              <w:t>基本面选股与赛道轮动研究</w:t>
             </w:r>
           </w:p>
         </w:tc>
@@ -913,7 +927,7 @@
                 <w:color w:val="555555"/>
                 <w:sz w:val="20"/>
               </w:rPr>
-              <w:t>2024.03 – 2026.08</w:t>
+              <w:t>2024.03 – 至今</w:t>
             </w:r>
           </w:p>
         </w:tc>
@@ -930,7 +944,7 @@
           <w:b w:val="0"/>
           <w:sz w:val="21"/>
         </w:rPr>
-        <w:t>宏观赛道研究 + 财务选股模型 + 业绩预告/快报及时性数据，服务多头选股与轮动。</w:t>
+        <w:t>宏观赛道研究、财务选股模型与业绩预告及时性数据相结合，服务多头选股与行业轮动判断。</w:t>
       </w:r>
     </w:p>
     <w:p>
@@ -944,7 +958,7 @@
           <w:b w:val="0"/>
           <w:sz w:val="21"/>
         </w:rPr>
-        <w:t>实盘资金加权：2025年年化约60%；2026年截至8月年化约40%。</w:t>
+        <w:t>实盘资金加权：2025年年化约60%，2026年截至8月约40%。</w:t>
       </w:r>
     </w:p>
     <w:tbl>
@@ -1020,7 +1034,7 @@
           <w:b w:val="0"/>
           <w:sz w:val="21"/>
         </w:rPr>
-        <w:t>Python + tbquant，基于拓扑空间结构距离做模式识别，在股指期货上完成策略开发、回测与参数优化。</w:t>
+        <w:t>Python结合tbquant，基于拓扑空间结构距离开发模式识别算法，在股指期货上完成策略开发、回测与参数优化。</w:t>
       </w:r>
     </w:p>
     <w:p>
@@ -1127,7 +1141,7 @@
           <w:b w:val="0"/>
           <w:sz w:val="21"/>
         </w:rPr>
-        <w:t>论文：《医药行业上市公司价值评估研究——以云南白药为例》（股利贴现 + 量化分析）。</w:t>
+        <w:t>论文：《医药行业上市公司价值评估研究——以云南白药为例》（股利贴现模型与量化分析）。</w:t>
       </w:r>
     </w:p>
     <w:tbl>
@@ -1220,7 +1234,7 @@
           <w:b w:val="0"/>
           <w:sz w:val="21"/>
         </w:rPr>
-        <w:t>Python：Pandas、Numpy、Talib，能独立完成日频/分钟行情与财报截面数据处理、因子计算、回测与可视化；会Linux服务器环境配置、脚本部署与定时任务。</w:t>
+        <w:t>Python：Pandas、Numpy、Talib，可独立完成日频与分钟行情、财报截面数据的处理、因子计算、回测与可视化；熟悉Linux服务器环境配置、脚本部署与定时任务。</w:t>
       </w:r>
     </w:p>
     <w:p>
@@ -1234,7 +1248,7 @@
           <w:b w:val="0"/>
           <w:sz w:val="21"/>
         </w:rPr>
-        <w:t>研究工具：聚宽、掘金、Wind、Stata、MATLAB、Excel；了解回测中的未来函数、过拟合与样本外失效问题，回测时做参数稳健性与对照检验。</w:t>
+        <w:t>研究工具：聚宽、掘金、Wind、Stata、MATLAB、Excel；理解未来函数、过拟合与样本外失效等回测陷阱，研究中做参数稳健性与对照检验。</w:t>
       </w:r>
     </w:p>
     <w:p>
@@ -1248,21 +1262,7 @@
           <w:b w:val="0"/>
           <w:sz w:val="21"/>
         </w:rPr>
-        <w:t>证书：证券 / 基金 / 银行从业资格，计算机二级；英语六级558。</w:t>
-      </w:r>
-    </w:p>
-    <w:p>
-      <w:pPr>
-        <w:spacing w:after="40" w:before="40" w:line="259" w:lineRule="auto"/>
-      </w:pPr>
-      <w:r>
-        <w:rPr>
-          <w:rFonts w:ascii="宋体" w:hAnsi="宋体" w:eastAsia="宋体"/>
-          <w:b w:val="0"/>
-          <w:color w:val="555555"/>
-          <w:sz w:val="18"/>
-        </w:rPr>
-        <w:t>说明：机器学习选股（XGBoost/LightGBM等）非本人主力工具栈，如团队需要可在现有因子与回测框架上快速补齐。</w:t>
+        <w:t>证书：证券、基金、银行从业资格，计算机二级；英语六级558，可阅读英文文献。</w:t>
       </w:r>
     </w:p>
     <w:p>

</xml_diff>

<commit_message>
Restore AI tooling skills line.
Keep Claude/Cursor/MCP on the resume, framed as tooling that supports data and backtest development rather than a standalone AI-ops skill set.

Co-authored-by: invy95 <invy95@users.noreply.github.com>
</commit_message>
<xml_diff>
--- a/resume/YinWei_Guolian_Quant_Resume.docx
+++ b/resume/YinWei_Guolian_Quant_Resume.docx
@@ -1249,6 +1249,19 @@
           <w:sz w:val="21"/>
         </w:rPr>
         <w:t>研究工具：聚宽、掘金、Wind、Stata、MATLAB、Excel；理解未来函数、过拟合与样本外失效等回测陷阱，研究中做参数稳健性与对照检验。</w:t>
+      </w:r>
+    </w:p>
+    <w:p>
+      <w:pPr>
+        <w:pStyle w:val="ListBullet"/>
+        <w:spacing w:after="24" w:before="0" w:line="259" w:lineRule="auto"/>
+      </w:pPr>
+      <w:r>
+        <w:rPr>
+          <w:rFonts w:ascii="宋体" w:hAnsi="宋体" w:eastAsia="宋体"/>
+          <w:sz w:val="21"/>
+        </w:rPr>
+        <w:t>AI辅助研发：熟练使用 Claude、Cursor 等 AI 编程工具辅助数据处理、因子与回测代码开发，了解 MCP 用法，提升研究迭代效率。</w:t>
       </w:r>
     </w:p>
     <w:p>

</xml_diff>

<commit_message>
Restore two facts from the candidate's original resume.
The original PDF carried a 2012-2018 seven-year CTA backtest window and
a 405/500 postgraduate exam total that the rewritten version had dropped.
The seven-year window is stronger evidence of sample stability than the
in-sample Sharpe figures, so it also gets a bullet deep-dive entry.

Co-authored-by: invy95 <invy95@users.noreply.github.com>
</commit_message>
<xml_diff>
--- a/resume/YinWei_Guolian_Quant_Resume.docx
+++ b/resume/YinWei_Guolian_Quant_Resume.docx
@@ -780,6 +780,22 @@
     </w:p>
     <w:p>
       <w:pPr>
+        <w:spacing w:before="0" w:after="20" w:line="252" w:lineRule="auto"/>
+        <w:ind w:left="283"/>
+      </w:pPr>
+      <w:r>
+        <w:rPr>
+          <w:rFonts w:ascii="Aptos" w:hAnsi="Aptos" w:eastAsia="Microsoft YaHei"/>
+          <w:b w:val="0"/>
+          <w:i w:val="0"/>
+          <w:color w:val="222222"/>
+          <w:sz w:val="20"/>
+        </w:rPr>
+        <w:t>• 回测覆盖 2012–2018 连续 7 年样本，用于检验形态信号在不同年份的稳定性，而非只看单一区间。</w:t>
+      </w:r>
+    </w:p>
+    <w:p>
+      <w:pPr>
         <w:spacing w:before="160" w:after="60" w:line="252" w:lineRule="auto"/>
         <w:pBdr>
           <w:bottom w:val="single" w:sz="6" w:space="2" w:color="1A535C"/>
@@ -838,7 +854,7 @@
           <w:color w:val="222222"/>
           <w:sz w:val="20"/>
         </w:rPr>
-        <w:t>• 主修量化投资、财务报表分析、金融建模与计算、数理统计；考研数学130/150。</w:t>
+        <w:t>• 主修量化投资、财务报表分析、金融建模与计算、数理统计；考研总分405/500，数学130/150。</w:t>
       </w:r>
     </w:p>
     <w:p>

</xml_diff>

<commit_message>
Use the social-insurance entity as the current employer.
The candidate's social insurance is paid by 湖北正知资产管理有限公司, an
AMAC-registered private securities fund manager (P1007881) under the
Zhengxuan Capital group, not by the group holding company. Naming the
registered entity keeps the resume consistent with background checks and
lets a securities-firm recruiter verify an otherwise unknown employer.

Also flag the unresolved conflict between the resume timeline and the
stated social-insurance periods for 量盈 and 引力波 as a blocking item.

Co-authored-by: invy95 <invy95@users.noreply.github.com>
</commit_message>
<xml_diff>
--- a/resume/YinWei_Guolian_Quant_Resume.docx
+++ b/resume/YinWei_Guolian_Quant_Resume.docx
@@ -210,7 +210,7 @@
           <w:color w:val="222222"/>
           <w:sz w:val="20"/>
         </w:rPr>
-        <w:t>【请填公司全称】（私募基金）  |  量化研究</w:t>
+        <w:t>湖北正知资产管理有限公司（私募证券投资基金管理人，中基协登记 P1007881）  |  量化研究</w:t>
       </w:r>
       <w:r>
         <w:rPr>
@@ -237,7 +237,7 @@
           <w:color w:val="222222"/>
           <w:sz w:val="20"/>
         </w:rPr>
-        <w:t>• 日常以投研流程工程化为主（日报与脚本落地、Linux 定时任务）；后期承接短线策略的验证与优化，而非从一开始就负责完整产品线。</w:t>
+        <w:t>• 公司既有策略以期货趋势跟踪、多空对冲与 FOF 为主，股票量化为新拓方向；本岗从零搭建股票投研流程，日常以流程工程化为主（日报与脚本落地、Linux 定时任务），后期承接短线策略的验证与优化。</w:t>
       </w:r>
     </w:p>
     <w:p>

</xml_diff>

<commit_message>
Rebuild the work history from the real social-insurance timeline.
The prior order was wrong in a way a background check would surface:
Gravitational Wave sat in 2023 instead of 2021, Liangying in 2020 instead
of 2022, and Jiangtong was stretched from four months to twenty. Reordering
to the real dates also puts the Juejin and stock-index CTA projects inside
the Liangying period, which is where the platform work actually happened.

Interview prep now carries the timeline table, the two employment gaps and
the fragmentation question, since those become the main objections once the
dates are honest.

Co-authored-by: invy95 <invy95@users.noreply.github.com>
</commit_message>
<xml_diff>
--- a/resume/YinWei_Guolian_Quant_Resume.docx
+++ b/resume/YinWei_Guolian_Quant_Resume.docx
@@ -380,6 +380,128 @@
           <w:color w:val="222222"/>
           <w:sz w:val="20"/>
         </w:rPr>
+        <w:t>江铜产融控股有限公司  |  量化研究员</w:t>
+      </w:r>
+      <w:r>
+        <w:rPr>
+          <w:rFonts w:ascii="Aptos" w:hAnsi="Aptos" w:eastAsia="Microsoft YaHei"/>
+          <w:b w:val="0"/>
+          <w:i w:val="0"/>
+          <w:color w:val="5A5A5A"/>
+          <w:sz w:val="20"/>
+        </w:rPr>
+        <w:tab/>
+        <w:t>2023.10 – 2024.02</w:t>
+      </w:r>
+    </w:p>
+    <w:p>
+      <w:pPr>
+        <w:spacing w:before="0" w:after="20" w:line="252" w:lineRule="auto"/>
+        <w:ind w:left="283"/>
+      </w:pPr>
+      <w:r>
+        <w:rPr>
+          <w:rFonts w:ascii="Aptos" w:hAnsi="Aptos" w:eastAsia="Microsoft YaHei"/>
+          <w:b w:val="0"/>
+          <w:i w:val="0"/>
+          <w:color w:val="222222"/>
+          <w:sz w:val="20"/>
+        </w:rPr>
+        <w:t>• 对北上深量化私募做问卷设计与实地尽调并撰写报告，覆盖策略逻辑、因子来源、风险控制与实盘约束。</w:t>
+      </w:r>
+    </w:p>
+    <w:p>
+      <w:pPr>
+        <w:spacing w:before="0" w:after="20" w:line="252" w:lineRule="auto"/>
+        <w:ind w:left="283"/>
+      </w:pPr>
+      <w:r>
+        <w:rPr>
+          <w:rFonts w:ascii="Aptos" w:hAnsi="Aptos" w:eastAsia="Microsoft YaHei"/>
+          <w:b w:val="0"/>
+          <w:i w:val="0"/>
+          <w:color w:val="222222"/>
+          <w:sz w:val="20"/>
+        </w:rPr>
+        <w:t>• 参与二级市场研究框架搭建，跟踪流动性等风险指标，服务投研判断与资产配置。</w:t>
+      </w:r>
+    </w:p>
+    <w:p>
+      <w:pPr>
+        <w:tabs>
+          <w:tab w:pos="9638" w:val="right"/>
+        </w:tabs>
+        <w:spacing w:before="80" w:after="20" w:line="252" w:lineRule="auto"/>
+      </w:pPr>
+      <w:r>
+        <w:rPr>
+          <w:rFonts w:ascii="Aptos" w:hAnsi="Aptos" w:eastAsia="Microsoft YaHei"/>
+          <w:b/>
+          <w:i w:val="0"/>
+          <w:color w:val="222222"/>
+          <w:sz w:val="20"/>
+        </w:rPr>
+        <w:t>量盈私募基金管理有限公司  |  量化研究员</w:t>
+      </w:r>
+      <w:r>
+        <w:rPr>
+          <w:rFonts w:ascii="Aptos" w:hAnsi="Aptos" w:eastAsia="Microsoft YaHei"/>
+          <w:b w:val="0"/>
+          <w:i w:val="0"/>
+          <w:color w:val="5A5A5A"/>
+          <w:sz w:val="20"/>
+        </w:rPr>
+        <w:tab/>
+        <w:t>2022.01 – 2023.02</w:t>
+      </w:r>
+    </w:p>
+    <w:p>
+      <w:pPr>
+        <w:spacing w:before="0" w:after="20" w:line="252" w:lineRule="auto"/>
+        <w:ind w:left="283"/>
+      </w:pPr>
+      <w:r>
+        <w:rPr>
+          <w:rFonts w:ascii="Aptos" w:hAnsi="Aptos" w:eastAsia="Microsoft YaHei"/>
+          <w:b w:val="0"/>
+          <w:i w:val="0"/>
+          <w:color w:val="222222"/>
+          <w:sz w:val="20"/>
+        </w:rPr>
+        <w:t>• 基于聚宽、掘金做股票与期货因子挖掘、策略开发及回测优化，覆盖日频量价与基本面相关因子；下方掘金短线多头与股指 CTA 两个项目均始于本阶段。</w:t>
+      </w:r>
+    </w:p>
+    <w:p>
+      <w:pPr>
+        <w:spacing w:before="0" w:after="20" w:line="252" w:lineRule="auto"/>
+        <w:ind w:left="283"/>
+      </w:pPr>
+      <w:r>
+        <w:rPr>
+          <w:rFonts w:ascii="Aptos" w:hAnsi="Aptos" w:eastAsia="Microsoft YaHei"/>
+          <w:b w:val="0"/>
+          <w:i w:val="0"/>
+          <w:color w:val="222222"/>
+          <w:sz w:val="20"/>
+        </w:rPr>
+        <w:t>• 按基金经理要求用 Python 复现券商金工研报，校验因子定义、去极值与标准化、回测口径及样本外表现。</w:t>
+      </w:r>
+    </w:p>
+    <w:p>
+      <w:pPr>
+        <w:tabs>
+          <w:tab w:pos="9638" w:val="right"/>
+        </w:tabs>
+        <w:spacing w:before="80" w:after="20" w:line="252" w:lineRule="auto"/>
+      </w:pPr>
+      <w:r>
+        <w:rPr>
+          <w:rFonts w:ascii="Aptos" w:hAnsi="Aptos" w:eastAsia="Microsoft YaHei"/>
+          <w:b/>
+          <w:i w:val="0"/>
+          <w:color w:val="222222"/>
+          <w:sz w:val="20"/>
+        </w:rPr>
         <w:t>深圳引力波量化科技有限公司  |  量化研究员</w:t>
       </w:r>
       <w:r>
@@ -391,7 +513,7 @@
           <w:sz w:val="20"/>
         </w:rPr>
         <w:tab/>
-        <w:t>2023.10 – 2024.02</w:t>
+        <w:t>2021.06 – 2021.12</w:t>
       </w:r>
     </w:p>
     <w:p>
@@ -424,128 +546,6 @@
           <w:sz w:val="20"/>
         </w:rPr>
         <w:t>• 参与套利、做市等策略的开发与日常优化，关注价差、持仓风险、成交质量与策略稳定性。</w:t>
-      </w:r>
-    </w:p>
-    <w:p>
-      <w:pPr>
-        <w:tabs>
-          <w:tab w:pos="9638" w:val="right"/>
-        </w:tabs>
-        <w:spacing w:before="80" w:after="20" w:line="252" w:lineRule="auto"/>
-      </w:pPr>
-      <w:r>
-        <w:rPr>
-          <w:rFonts w:ascii="Aptos" w:hAnsi="Aptos" w:eastAsia="Microsoft YaHei"/>
-          <w:b/>
-          <w:i w:val="0"/>
-          <w:color w:val="222222"/>
-          <w:sz w:val="20"/>
-        </w:rPr>
-        <w:t>江铜产融控股有限公司  |  量化研究员</w:t>
-      </w:r>
-      <w:r>
-        <w:rPr>
-          <w:rFonts w:ascii="Aptos" w:hAnsi="Aptos" w:eastAsia="Microsoft YaHei"/>
-          <w:b w:val="0"/>
-          <w:i w:val="0"/>
-          <w:color w:val="5A5A5A"/>
-          <w:sz w:val="20"/>
-        </w:rPr>
-        <w:tab/>
-        <w:t>2022.01 – 2023.09</w:t>
-      </w:r>
-    </w:p>
-    <w:p>
-      <w:pPr>
-        <w:spacing w:before="0" w:after="20" w:line="252" w:lineRule="auto"/>
-        <w:ind w:left="283"/>
-      </w:pPr>
-      <w:r>
-        <w:rPr>
-          <w:rFonts w:ascii="Aptos" w:hAnsi="Aptos" w:eastAsia="Microsoft YaHei"/>
-          <w:b w:val="0"/>
-          <w:i w:val="0"/>
-          <w:color w:val="222222"/>
-          <w:sz w:val="20"/>
-        </w:rPr>
-        <w:t>• 对北上深量化私募做问卷设计与实地尽调并撰写报告，覆盖策略逻辑、因子来源、风险控制与实盘约束。</w:t>
-      </w:r>
-    </w:p>
-    <w:p>
-      <w:pPr>
-        <w:spacing w:before="0" w:after="20" w:line="252" w:lineRule="auto"/>
-        <w:ind w:left="283"/>
-      </w:pPr>
-      <w:r>
-        <w:rPr>
-          <w:rFonts w:ascii="Aptos" w:hAnsi="Aptos" w:eastAsia="Microsoft YaHei"/>
-          <w:b w:val="0"/>
-          <w:i w:val="0"/>
-          <w:color w:val="222222"/>
-          <w:sz w:val="20"/>
-        </w:rPr>
-        <w:t>• 搭建二级市场研究框架，跟踪流动性等风险指标，服务投研判断与资产配置。</w:t>
-      </w:r>
-    </w:p>
-    <w:p>
-      <w:pPr>
-        <w:tabs>
-          <w:tab w:pos="9638" w:val="right"/>
-        </w:tabs>
-        <w:spacing w:before="80" w:after="20" w:line="252" w:lineRule="auto"/>
-      </w:pPr>
-      <w:r>
-        <w:rPr>
-          <w:rFonts w:ascii="Aptos" w:hAnsi="Aptos" w:eastAsia="Microsoft YaHei"/>
-          <w:b/>
-          <w:i w:val="0"/>
-          <w:color w:val="222222"/>
-          <w:sz w:val="20"/>
-        </w:rPr>
-        <w:t>量盈私募基金管理有限公司  |  量化研究员</w:t>
-      </w:r>
-      <w:r>
-        <w:rPr>
-          <w:rFonts w:ascii="Aptos" w:hAnsi="Aptos" w:eastAsia="Microsoft YaHei"/>
-          <w:b w:val="0"/>
-          <w:i w:val="0"/>
-          <w:color w:val="5A5A5A"/>
-          <w:sz w:val="20"/>
-        </w:rPr>
-        <w:tab/>
-        <w:t>2020.08 – 2021.12</w:t>
-      </w:r>
-    </w:p>
-    <w:p>
-      <w:pPr>
-        <w:spacing w:before="0" w:after="20" w:line="252" w:lineRule="auto"/>
-        <w:ind w:left="283"/>
-      </w:pPr>
-      <w:r>
-        <w:rPr>
-          <w:rFonts w:ascii="Aptos" w:hAnsi="Aptos" w:eastAsia="Microsoft YaHei"/>
-          <w:b w:val="0"/>
-          <w:i w:val="0"/>
-          <w:color w:val="222222"/>
-          <w:sz w:val="20"/>
-        </w:rPr>
-        <w:t>• 基于聚宽、掘金做股票与期货因子挖掘、策略开发及回测优化，覆盖日频量价与基本面相关因子。</w:t>
-      </w:r>
-    </w:p>
-    <w:p>
-      <w:pPr>
-        <w:spacing w:before="0" w:after="20" w:line="252" w:lineRule="auto"/>
-        <w:ind w:left="283"/>
-      </w:pPr>
-      <w:r>
-        <w:rPr>
-          <w:rFonts w:ascii="Aptos" w:hAnsi="Aptos" w:eastAsia="Microsoft YaHei"/>
-          <w:b w:val="0"/>
-          <w:i w:val="0"/>
-          <w:color w:val="222222"/>
-          <w:sz w:val="20"/>
-        </w:rPr>
-        <w:t>• 按基金经理要求用 Python 复现券商金工研报，校验因子定义、去极值与标准化、回测口径及样本外表现。</w:t>
       </w:r>
     </w:p>
     <w:p>

</xml_diff>